<commit_message>
refactor: file and folder restructuring
</commit_message>
<xml_diff>
--- a/generative-ai/extracted-notes/generative-ai-part-1.docx
+++ b/generative-ai/extracted-notes/generative-ai-part-1.docx
@@ -103,6 +103,9 @@
     </w:p>
     <w:p>
       <w:r>
+        <w:rPr>
+          <w:noProof/>
+        </w:rPr>
         <w:drawing>
           <wp:inline distT="0" distB="0" distL="0" distR="0" wp14:anchorId="0D7A7027" wp14:editId="1387DCF6">
             <wp:extent cx="5872464" cy="2463800"/>
@@ -154,6 +157,152 @@
         <w:t xml:space="preserve"> IDE, GitHub Mobile, Windows Terminal Canary, GitHub CLI, and GitHub website.</w:t>
       </w:r>
     </w:p>
+    <w:p>
+      <w:pPr>
+        <w:pStyle w:val="Heading1"/>
+      </w:pPr>
+      <w:proofErr w:type="spellStart"/>
+      <w:r>
+        <w:lastRenderedPageBreak/>
+        <w:t>ByteByteGo</w:t>
+      </w:r>
+      <w:proofErr w:type="spellEnd"/>
+    </w:p>
+    <w:p>
+      <w:r>
+        <w:t>3 waves of AI evolution in coding –</w:t>
+      </w:r>
+    </w:p>
+    <w:p>
+      <w:r>
+        <w:rPr>
+          <w:noProof/>
+        </w:rPr>
+        <w:drawing>
+          <wp:inline distT="0" distB="0" distL="0" distR="0" wp14:anchorId="18AFFE7B" wp14:editId="14693CB2">
+            <wp:extent cx="4094857" cy="5137150"/>
+            <wp:effectExtent l="0" t="0" r="1270" b="6350"/>
+            <wp:docPr id="120474495" name="Picture 1" descr="Image"/>
+            <wp:cNvGraphicFramePr>
+              <a:graphicFrameLocks xmlns:a="http://schemas.openxmlformats.org/drawingml/2006/main" noChangeAspect="1"/>
+            </wp:cNvGraphicFramePr>
+            <a:graphic xmlns:a="http://schemas.openxmlformats.org/drawingml/2006/main">
+              <a:graphicData uri="http://schemas.openxmlformats.org/drawingml/2006/picture">
+                <pic:pic xmlns:pic="http://schemas.openxmlformats.org/drawingml/2006/picture">
+                  <pic:nvPicPr>
+                    <pic:cNvPr id="0" name="Picture 1" descr="Image"/>
+                    <pic:cNvPicPr>
+                      <a:picLocks noChangeAspect="1" noChangeArrowheads="1"/>
+                    </pic:cNvPicPr>
+                  </pic:nvPicPr>
+                  <pic:blipFill>
+                    <a:blip r:embed="rId6" cstate="print">
+                      <a:extLst>
+                        <a:ext uri="{28A0092B-C50C-407E-A947-70E740481C1C}">
+                          <a14:useLocalDpi xmlns:a14="http://schemas.microsoft.com/office/drawing/2010/main" val="0"/>
+                        </a:ext>
+                      </a:extLst>
+                    </a:blip>
+                    <a:srcRect/>
+                    <a:stretch>
+                      <a:fillRect/>
+                    </a:stretch>
+                  </pic:blipFill>
+                  <pic:spPr bwMode="auto">
+                    <a:xfrm>
+                      <a:off x="0" y="0"/>
+                      <a:ext cx="4105293" cy="5150242"/>
+                    </a:xfrm>
+                    <a:prstGeom prst="rect">
+                      <a:avLst/>
+                    </a:prstGeom>
+                    <a:noFill/>
+                    <a:ln>
+                      <a:noFill/>
+                    </a:ln>
+                  </pic:spPr>
+                </pic:pic>
+              </a:graphicData>
+            </a:graphic>
+          </wp:inline>
+        </w:drawing>
+      </w:r>
+    </w:p>
+    <w:p>
+      <w:r>
+        <w:t>Agentic browser workflow –</w:t>
+      </w:r>
+      <w:r>
+        <w:t xml:space="preserve"> </w:t>
+      </w:r>
+      <w:r>
+        <w:t>Agentic browsers embed an agent that can read webpages and take actions in your browser.</w:t>
+      </w:r>
+    </w:p>
+    <w:p>
+      <w:r>
+        <w:rPr>
+          <w:noProof/>
+        </w:rPr>
+        <w:lastRenderedPageBreak/>
+        <w:drawing>
+          <wp:inline distT="0" distB="0" distL="0" distR="0" wp14:anchorId="21D4304D" wp14:editId="75ED8A1E">
+            <wp:extent cx="4990765" cy="6261100"/>
+            <wp:effectExtent l="0" t="0" r="635" b="6350"/>
+            <wp:docPr id="1095241012" name="Picture 2" descr="Image"/>
+            <wp:cNvGraphicFramePr>
+              <a:graphicFrameLocks xmlns:a="http://schemas.openxmlformats.org/drawingml/2006/main" noChangeAspect="1"/>
+            </wp:cNvGraphicFramePr>
+            <a:graphic xmlns:a="http://schemas.openxmlformats.org/drawingml/2006/main">
+              <a:graphicData uri="http://schemas.openxmlformats.org/drawingml/2006/picture">
+                <pic:pic xmlns:pic="http://schemas.openxmlformats.org/drawingml/2006/picture">
+                  <pic:nvPicPr>
+                    <pic:cNvPr id="0" name="Picture 3" descr="Image"/>
+                    <pic:cNvPicPr>
+                      <a:picLocks noChangeAspect="1" noChangeArrowheads="1"/>
+                    </pic:cNvPicPr>
+                  </pic:nvPicPr>
+                  <pic:blipFill>
+                    <a:blip r:embed="rId7">
+                      <a:extLst>
+                        <a:ext uri="{28A0092B-C50C-407E-A947-70E740481C1C}">
+                          <a14:useLocalDpi xmlns:a14="http://schemas.microsoft.com/office/drawing/2010/main" val="0"/>
+                        </a:ext>
+                      </a:extLst>
+                    </a:blip>
+                    <a:srcRect/>
+                    <a:stretch>
+                      <a:fillRect/>
+                    </a:stretch>
+                  </pic:blipFill>
+                  <pic:spPr bwMode="auto">
+                    <a:xfrm>
+                      <a:off x="0" y="0"/>
+                      <a:ext cx="4994629" cy="6265948"/>
+                    </a:xfrm>
+                    <a:prstGeom prst="rect">
+                      <a:avLst/>
+                    </a:prstGeom>
+                    <a:noFill/>
+                    <a:ln>
+                      <a:noFill/>
+                    </a:ln>
+                  </pic:spPr>
+                </pic:pic>
+              </a:graphicData>
+            </a:graphic>
+          </wp:inline>
+        </w:drawing>
+      </w:r>
+    </w:p>
+    <w:p/>
+    <w:p/>
+    <w:p/>
+    <w:p/>
+    <w:p/>
+    <w:p/>
+    <w:p/>
+    <w:p/>
     <w:p/>
     <w:sectPr>
       <w:pgSz w:w="12240" w:h="15840"/>
@@ -770,7 +919,6 @@
   <w:style w:type="character" w:default="1" w:styleId="DefaultParagraphFont">
     <w:name w:val="Default Paragraph Font"/>
     <w:uiPriority w:val="1"/>
-    <w:semiHidden/>
     <w:unhideWhenUsed/>
   </w:style>
   <w:style w:type="table" w:default="1" w:styleId="TableNormal">

</xml_diff>

<commit_message>
refactor: folder and content restructure
</commit_message>
<xml_diff>
--- a/generative-ai/extracted-notes/generative-ai-part-1.docx
+++ b/generative-ai/extracted-notes/generative-ai-part-1.docx
@@ -161,10 +161,12 @@
       <w:pPr>
         <w:pStyle w:val="Heading1"/>
       </w:pPr>
+      <w:proofErr w:type="spellStart"/>
       <w:r>
         <w:lastRenderedPageBreak/>
         <w:t>ByteByteGo</w:t>
       </w:r>
+      <w:proofErr w:type="spellEnd"/>
     </w:p>
     <w:p>
       <w:r>
@@ -477,6 +479,228 @@
       </w:r>
     </w:p>
     <w:p>
+      <w:r>
+        <w:t>11 ways to increase productivity with AI – general, learning, meetings, search, app building, diagrams, voice, coding, slides, workflow automation, calendar.</w:t>
+      </w:r>
+    </w:p>
+    <w:p>
+      <w:r>
+        <w:rPr>
+          <w:noProof/>
+        </w:rPr>
+        <w:lastRenderedPageBreak/>
+        <w:drawing>
+          <wp:inline distT="0" distB="0" distL="0" distR="0" wp14:anchorId="13A43C75" wp14:editId="351DEC16">
+            <wp:extent cx="4331650" cy="5431809"/>
+            <wp:effectExtent l="0" t="0" r="0" b="0"/>
+            <wp:docPr id="204446881" name="Picture 1" descr="No alternative text description for this image"/>
+            <wp:cNvGraphicFramePr>
+              <a:graphicFrameLocks xmlns:a="http://schemas.openxmlformats.org/drawingml/2006/main" noChangeAspect="1"/>
+            </wp:cNvGraphicFramePr>
+            <a:graphic xmlns:a="http://schemas.openxmlformats.org/drawingml/2006/main">
+              <a:graphicData uri="http://schemas.openxmlformats.org/drawingml/2006/picture">
+                <pic:pic xmlns:pic="http://schemas.openxmlformats.org/drawingml/2006/picture">
+                  <pic:nvPicPr>
+                    <pic:cNvPr id="0" name="Picture 1" descr="No alternative text description for this image"/>
+                    <pic:cNvPicPr>
+                      <a:picLocks noChangeAspect="1" noChangeArrowheads="1"/>
+                    </pic:cNvPicPr>
+                  </pic:nvPicPr>
+                  <pic:blipFill>
+                    <a:blip r:embed="rId11" cstate="print">
+                      <a:extLst>
+                        <a:ext uri="{28A0092B-C50C-407E-A947-70E740481C1C}">
+                          <a14:useLocalDpi xmlns:a14="http://schemas.microsoft.com/office/drawing/2010/main" val="0"/>
+                        </a:ext>
+                      </a:extLst>
+                    </a:blip>
+                    <a:srcRect/>
+                    <a:stretch>
+                      <a:fillRect/>
+                    </a:stretch>
+                  </pic:blipFill>
+                  <pic:spPr bwMode="auto">
+                    <a:xfrm>
+                      <a:off x="0" y="0"/>
+                      <a:ext cx="4342962" cy="5445994"/>
+                    </a:xfrm>
+                    <a:prstGeom prst="rect">
+                      <a:avLst/>
+                    </a:prstGeom>
+                    <a:noFill/>
+                    <a:ln>
+                      <a:noFill/>
+                    </a:ln>
+                  </pic:spPr>
+                </pic:pic>
+              </a:graphicData>
+            </a:graphic>
+          </wp:inline>
+        </w:drawing>
+      </w:r>
+    </w:p>
+    <w:p>
+      <w:r>
+        <w:t xml:space="preserve">AI algorithms every AI engineer should know – linear regression, logistic regression, K-Nearest neighbor, decision trees, Naïve bayes classifier, k-means clustering, back </w:t>
+      </w:r>
+      <w:proofErr w:type="spellStart"/>
+      <w:r>
+        <w:t>propatation</w:t>
+      </w:r>
+      <w:proofErr w:type="spellEnd"/>
+      <w:r>
+        <w:t>, transformer, self-attention, CNN, post-training (SFT, RLHF), RAG</w:t>
+      </w:r>
+    </w:p>
+    <w:p>
+      <w:r>
+        <w:rPr>
+          <w:noProof/>
+        </w:rPr>
+        <w:lastRenderedPageBreak/>
+        <w:drawing>
+          <wp:inline distT="0" distB="0" distL="0" distR="0" wp14:anchorId="640F0442" wp14:editId="2F2333B1">
+            <wp:extent cx="5471998" cy="6864824"/>
+            <wp:effectExtent l="0" t="0" r="0" b="0"/>
+            <wp:docPr id="1524631541" name="Picture 2" descr="Image"/>
+            <wp:cNvGraphicFramePr>
+              <a:graphicFrameLocks xmlns:a="http://schemas.openxmlformats.org/drawingml/2006/main" noChangeAspect="1"/>
+            </wp:cNvGraphicFramePr>
+            <a:graphic xmlns:a="http://schemas.openxmlformats.org/drawingml/2006/main">
+              <a:graphicData uri="http://schemas.openxmlformats.org/drawingml/2006/picture">
+                <pic:pic xmlns:pic="http://schemas.openxmlformats.org/drawingml/2006/picture">
+                  <pic:nvPicPr>
+                    <pic:cNvPr id="0" name="Picture 3" descr="Image"/>
+                    <pic:cNvPicPr>
+                      <a:picLocks noChangeAspect="1" noChangeArrowheads="1"/>
+                    </pic:cNvPicPr>
+                  </pic:nvPicPr>
+                  <pic:blipFill>
+                    <a:blip r:embed="rId12">
+                      <a:extLst>
+                        <a:ext uri="{28A0092B-C50C-407E-A947-70E740481C1C}">
+                          <a14:useLocalDpi xmlns:a14="http://schemas.microsoft.com/office/drawing/2010/main" val="0"/>
+                        </a:ext>
+                      </a:extLst>
+                    </a:blip>
+                    <a:srcRect/>
+                    <a:stretch>
+                      <a:fillRect/>
+                    </a:stretch>
+                  </pic:blipFill>
+                  <pic:spPr bwMode="auto">
+                    <a:xfrm>
+                      <a:off x="0" y="0"/>
+                      <a:ext cx="5483498" cy="6879251"/>
+                    </a:xfrm>
+                    <a:prstGeom prst="rect">
+                      <a:avLst/>
+                    </a:prstGeom>
+                    <a:noFill/>
+                    <a:ln>
+                      <a:noFill/>
+                    </a:ln>
+                  </pic:spPr>
+                </pic:pic>
+              </a:graphicData>
+            </a:graphic>
+          </wp:inline>
+        </w:drawing>
+      </w:r>
+    </w:p>
+    <w:p>
+      <w:r>
+        <w:t xml:space="preserve">AI topics to learn before taking AI interviews – support vector machines, regularization, bias-variance tradeoff, confusion matrix, cross validation, </w:t>
+      </w:r>
+      <w:proofErr w:type="gramStart"/>
+      <w:r>
+        <w:t>principle</w:t>
+      </w:r>
+      <w:proofErr w:type="gramEnd"/>
+      <w:r>
+        <w:t xml:space="preserve"> component analysis, variational autoencoder, diffusion models, generative adversarial networks, low-rank adaptation, K-cache, text decoding.</w:t>
+      </w:r>
+    </w:p>
+    <w:p>
+      <w:r>
+        <w:t>Why AI needs GPUs and TPUs – CPUs can handle such calculations sequentially. To perform any calculation, the CPU must fetch an instruction, retrieve data from memory, execute the operation, and write results back. This constant transfer of information between the processor and memory is not very efficient. It’s like having one very smart person solve a giant puzzle alone.</w:t>
+      </w:r>
+    </w:p>
+    <w:p>
+      <w:r>
+        <w:t>GPUs change the game with parallel processing. They split the work across hundreds of cores, reducing processing time to milliseconds.</w:t>
+      </w:r>
+    </w:p>
+    <w:p>
+      <w:r>
+        <w:lastRenderedPageBreak/>
+        <w:t xml:space="preserve">However, TPUs take it even further with a systolic array architecture that’s thousands of times faster than CPUs. Each unit in a TPU multiplies its stored weight by incoming data, adds to a running sum flowing vertically, and passes both values to its neighbor. This cuts down on </w:t>
+      </w:r>
+      <w:proofErr w:type="gramStart"/>
+      <w:r>
+        <w:t>I/O costs</w:t>
+      </w:r>
+      <w:proofErr w:type="gramEnd"/>
+      <w:r>
+        <w:t xml:space="preserve"> and reduces processing times even further.</w:t>
+      </w:r>
+    </w:p>
+    <w:p>
+      <w:r>
+        <w:rPr>
+          <w:noProof/>
+        </w:rPr>
+        <w:drawing>
+          <wp:inline distT="0" distB="0" distL="0" distR="0" wp14:anchorId="7482CD5D" wp14:editId="2DA81753">
+            <wp:extent cx="4421196" cy="5343098"/>
+            <wp:effectExtent l="0" t="0" r="0" b="0"/>
+            <wp:docPr id="1329805713" name="Picture 3"/>
+            <wp:cNvGraphicFramePr>
+              <a:graphicFrameLocks xmlns:a="http://schemas.openxmlformats.org/drawingml/2006/main" noChangeAspect="1"/>
+            </wp:cNvGraphicFramePr>
+            <a:graphic xmlns:a="http://schemas.openxmlformats.org/drawingml/2006/main">
+              <a:graphicData uri="http://schemas.openxmlformats.org/drawingml/2006/picture">
+                <pic:pic xmlns:pic="http://schemas.openxmlformats.org/drawingml/2006/picture">
+                  <pic:nvPicPr>
+                    <pic:cNvPr id="0" name="Picture 5"/>
+                    <pic:cNvPicPr>
+                      <a:picLocks noChangeAspect="1" noChangeArrowheads="1"/>
+                    </pic:cNvPicPr>
+                  </pic:nvPicPr>
+                  <pic:blipFill>
+                    <a:blip r:embed="rId13" cstate="print">
+                      <a:extLst>
+                        <a:ext uri="{28A0092B-C50C-407E-A947-70E740481C1C}">
+                          <a14:useLocalDpi xmlns:a14="http://schemas.microsoft.com/office/drawing/2010/main" val="0"/>
+                        </a:ext>
+                      </a:extLst>
+                    </a:blip>
+                    <a:srcRect/>
+                    <a:stretch>
+                      <a:fillRect/>
+                    </a:stretch>
+                  </pic:blipFill>
+                  <pic:spPr bwMode="auto">
+                    <a:xfrm>
+                      <a:off x="0" y="0"/>
+                      <a:ext cx="4428781" cy="5352264"/>
+                    </a:xfrm>
+                    <a:prstGeom prst="rect">
+                      <a:avLst/>
+                    </a:prstGeom>
+                    <a:noFill/>
+                    <a:ln>
+                      <a:noFill/>
+                    </a:ln>
+                  </pic:spPr>
+                </pic:pic>
+              </a:graphicData>
+            </a:graphic>
+          </wp:inline>
+        </w:drawing>
+      </w:r>
+    </w:p>
+    <w:p>
       <w:pPr>
         <w:pStyle w:val="Heading1"/>
       </w:pPr>
@@ -497,6 +721,7 @@
         <w:rPr>
           <w:noProof/>
         </w:rPr>
+        <w:lastRenderedPageBreak/>
         <w:drawing>
           <wp:inline distT="0" distB="0" distL="0" distR="0" wp14:anchorId="03628D5E" wp14:editId="24563AA3">
             <wp:extent cx="4487594" cy="2144488"/>
@@ -513,7 +738,7 @@
                     <pic:cNvPicPr/>
                   </pic:nvPicPr>
                   <pic:blipFill>
-                    <a:blip r:embed="rId11"/>
+                    <a:blip r:embed="rId14"/>
                     <a:stretch>
                       <a:fillRect/>
                     </a:stretch>
@@ -572,7 +797,6 @@
         <w:rPr>
           <w:noProof/>
         </w:rPr>
-        <w:lastRenderedPageBreak/>
         <w:drawing>
           <wp:inline distT="0" distB="0" distL="0" distR="0" wp14:anchorId="415FA92E" wp14:editId="0DEA2A72">
             <wp:extent cx="6134415" cy="4026107"/>
@@ -589,7 +813,7 @@
                     <pic:cNvPicPr/>
                   </pic:nvPicPr>
                   <pic:blipFill>
-                    <a:blip r:embed="rId12"/>
+                    <a:blip r:embed="rId15"/>
                     <a:stretch>
                       <a:fillRect/>
                     </a:stretch>
@@ -652,6 +876,7 @@
     </w:p>
     <w:p>
       <w:r>
+        <w:lastRenderedPageBreak/>
         <w:t>Context injection - this is where the user provides the chatbot with additional information at the time of the request. This data could include relevant data about the user like recent orders, documents, etc. to give the chatbot a full picture.</w:t>
       </w:r>
     </w:p>
@@ -665,12 +890,6 @@
         <w:t>By using the azure ai foundry, we can build chatbot to work with text, video, images or even audio.</w:t>
       </w:r>
     </w:p>
-    <w:p/>
-    <w:p/>
-    <w:p/>
-    <w:p/>
-    <w:p/>
-    <w:p/>
     <w:p/>
     <w:p/>
     <w:p/>

</xml_diff>